<commit_message>
chore: reorganize documentation and UI resources
Documentation updates:
- Add project README and specs overview
- Add AI-integrated export specification
- Add implementation plan for flowchart manual editing
- Add gantt chart interactive editing specifications
- Archive connector adsorption session documentation
- Update flowchart manual editing README

UI organization:
- Move icon catalog HTML files to docs/ui/icon/ directory
- Add new property-based SVG icon catalog
- Consolidate UI resources for better organization

Other changes:
- Update task-manager.html with latest features
- Update project archive documentation

This commit organizes the project documentation structure
and consolidates UI resources for better maintainability.
</commit_message>
<xml_diff>
--- a/docs/archive/prompts/di_pr1.docx
+++ b/docs/archive/prompts/di_pr1.docx
@@ -7720,11 +7720,2443 @@
         <w:snapToGrid w:val="0"/>
         <w:ind w:left="360"/>
         <w:rPr>
-          <w:rFonts w:hint="eastAsia"/>
-          <w:b/>
-          <w:bCs/>
-        </w:rPr>
-      </w:pPr>
+          <w:b/>
+          <w:bCs/>
+        </w:rPr>
+      </w:pPr>
+      <w:r>
+        <w:rPr>
+          <w:rFonts w:hint="eastAsia"/>
+          <w:b/>
+          <w:bCs/>
+        </w:rPr>
+        <w:t>ミニマップ</w:t>
+      </w:r>
+      <w:r>
+        <w:rPr>
+          <w:rFonts w:hint="eastAsia"/>
+          <w:b/>
+          <w:bCs/>
+        </w:rPr>
+        <w:t>上の全体表示範囲を示す矩形サイズが</w:t>
+      </w:r>
+      <w:r>
+        <w:rPr>
+          <w:rFonts w:hint="eastAsia"/>
+          <w:b/>
+          <w:bCs/>
+        </w:rPr>
+        <w:t>おそらくY座標しか捉えておらず、X座標の左右の絞り込みが計算されていないか反映されていません。また、ミニマップ画面も「要素情報」画面と同様に固定した位置で常に表示される仕様としてください。現状の位置仕様だとSVGエリアを下方へスクロールすると左上に配置したミニマップが上方の画面枠外へ非表示となるため不便です。</w:t>
+      </w:r>
+    </w:p>
+    <w:p>
+      <w:pPr>
+        <w:pStyle w:val="a9"/>
+        <w:snapToGrid w:val="0"/>
+        <w:ind w:left="360"/>
+        <w:rPr>
+          <w:b/>
+          <w:bCs/>
+        </w:rPr>
+      </w:pPr>
+      <w:r>
+        <w:rPr>
+          <w:rFonts w:hint="eastAsia"/>
+          <w:b/>
+          <w:bCs/>
+        </w:rPr>
+        <w:t>簡易的なアスキーアートで実装イメージを教えてください。</w:t>
+      </w:r>
+    </w:p>
+    <w:p>
+      <w:pPr>
+        <w:pStyle w:val="a9"/>
+        <w:snapToGrid w:val="0"/>
+        <w:ind w:left="360"/>
+        <w:rPr>
+          <w:b/>
+          <w:bCs/>
+        </w:rPr>
+      </w:pPr>
+      <w:r>
+        <w:rPr>
+          <w:b/>
+          <w:bCs/>
+        </w:rPr>
+        <w:t>**まだ実装はせず見解のみを教えて下さい**</w:t>
+      </w:r>
+    </w:p>
+    <w:p>
+      <w:pPr>
+        <w:pStyle w:val="a9"/>
+        <w:snapToGrid w:val="0"/>
+        <w:ind w:left="360"/>
+        <w:rPr>
+          <w:b/>
+          <w:bCs/>
+        </w:rPr>
+      </w:pPr>
+    </w:p>
+    <w:p>
+      <w:pPr>
+        <w:pStyle w:val="a9"/>
+        <w:pBdr>
+          <w:bottom w:val="single" w:sz="6" w:space="1" w:color="auto"/>
+        </w:pBdr>
+        <w:snapToGrid w:val="0"/>
+        <w:ind w:left="360"/>
+        <w:rPr>
+          <w:b/>
+          <w:bCs/>
+        </w:rPr>
+      </w:pPr>
+    </w:p>
+    <w:p>
+      <w:pPr>
+        <w:pStyle w:val="a9"/>
+        <w:snapToGrid w:val="0"/>
+        <w:ind w:left="360"/>
+        <w:rPr>
+          <w:b/>
+          <w:bCs/>
+        </w:rPr>
+      </w:pPr>
+      <w:r>
+        <w:rPr>
+          <w:rFonts w:hint="eastAsia"/>
+          <w:b/>
+          <w:bCs/>
+        </w:rPr>
+        <w:t>ミニマップ</w:t>
+      </w:r>
+      <w:r>
+        <w:rPr>
+          <w:rFonts w:hint="eastAsia"/>
+          <w:b/>
+          <w:bCs/>
+        </w:rPr>
+        <w:t>上の全体表示範囲を示す矩形サイズ</w:t>
+      </w:r>
+      <w:r>
+        <w:rPr>
+          <w:rFonts w:hint="eastAsia"/>
+          <w:b/>
+          <w:bCs/>
+        </w:rPr>
+        <w:t>を合わすのが困難であるならミニマップの画面幅をブラウザ画面幅比率として追従するとかできないんですか？現状X方向のミニマップビューポートが無視されていて非常にレベルが低く感じます</w:t>
+      </w:r>
+    </w:p>
+    <w:p>
+      <w:pPr>
+        <w:pStyle w:val="a9"/>
+        <w:pBdr>
+          <w:bottom w:val="single" w:sz="6" w:space="1" w:color="auto"/>
+        </w:pBdr>
+        <w:snapToGrid w:val="0"/>
+        <w:ind w:left="360"/>
+        <w:rPr>
+          <w:b/>
+          <w:bCs/>
+        </w:rPr>
+      </w:pPr>
+    </w:p>
+    <w:p>
+      <w:pPr>
+        <w:pStyle w:val="a9"/>
+        <w:snapToGrid w:val="0"/>
+        <w:ind w:left="360"/>
+        <w:rPr>
+          <w:b/>
+          <w:bCs/>
+        </w:rPr>
+      </w:pPr>
+      <w:r>
+        <w:rPr>
+          <w:rFonts w:hint="eastAsia"/>
+          <w:b/>
+          <w:bCs/>
+        </w:rPr>
+        <w:t>改善しました。</w:t>
+      </w:r>
+      <w:r>
+        <w:rPr>
+          <w:rFonts w:hint="eastAsia"/>
+          <w:b/>
+          <w:bCs/>
+        </w:rPr>
+        <w:t>ここまでの内容を</w:t>
+      </w:r>
+      <w:proofErr w:type="spellStart"/>
+      <w:r>
+        <w:rPr>
+          <w:b/>
+          <w:bCs/>
+        </w:rPr>
+        <w:t>Github</w:t>
+      </w:r>
+      <w:proofErr w:type="spellEnd"/>
+      <w:r>
+        <w:rPr>
+          <w:b/>
+          <w:bCs/>
+        </w:rPr>
+        <w:t>へコミットするための方針を策定してください。</w:t>
+      </w:r>
+    </w:p>
+    <w:p>
+      <w:pPr>
+        <w:pStyle w:val="a9"/>
+        <w:snapToGrid w:val="0"/>
+        <w:ind w:left="360"/>
+        <w:rPr>
+          <w:b/>
+          <w:bCs/>
+        </w:rPr>
+      </w:pPr>
+      <w:r>
+        <w:rPr>
+          <w:b/>
+          <w:bCs/>
+        </w:rPr>
+        <w:t>**まだ実装はせず見解のみを教えて下さい**</w:t>
+      </w:r>
+    </w:p>
+    <w:p>
+      <w:pPr>
+        <w:pStyle w:val="a9"/>
+        <w:pBdr>
+          <w:bottom w:val="single" w:sz="6" w:space="1" w:color="auto"/>
+        </w:pBdr>
+        <w:snapToGrid w:val="0"/>
+        <w:ind w:left="360"/>
+        <w:rPr>
+          <w:b/>
+          <w:bCs/>
+        </w:rPr>
+      </w:pPr>
+    </w:p>
+    <w:p>
+      <w:pPr>
+        <w:pStyle w:val="a9"/>
+        <w:snapToGrid w:val="0"/>
+        <w:ind w:left="360"/>
+        <w:rPr>
+          <w:b/>
+          <w:bCs/>
+        </w:rPr>
+      </w:pPr>
+      <w:r>
+        <w:rPr>
+          <w:rFonts w:hint="eastAsia"/>
+          <w:b/>
+          <w:bCs/>
+        </w:rPr>
+        <w:t>SVGの各ノードやエッジ/エッジラベルをクリックしたら要素情報がクリックして選択された要素に固定され、そこにメモ書きで属性情報を入力できるようにしたいのですがいかがですか？それらは</w:t>
+      </w:r>
+      <w:r>
+        <w:rPr>
+          <w:b/>
+          <w:bCs/>
+        </w:rPr>
+        <w:t>"C:\dev\task-manager\task-manager.html"</w:t>
+      </w:r>
+      <w:r>
+        <w:rPr>
+          <w:rFonts w:hint="eastAsia"/>
+          <w:b/>
+          <w:bCs/>
+        </w:rPr>
+        <w:t>本体ページと同様に</w:t>
+      </w:r>
+      <w:r>
+        <w:rPr>
+          <w:rFonts w:hint="eastAsia"/>
+          <w:b/>
+          <w:bCs/>
+        </w:rPr>
+        <w:t>「</w:t>
+      </w:r>
+      <w:r>
+        <w:rPr>
+          <w:b/>
+          <w:bCs/>
+        </w:rPr>
+        <w:t>File System Access API」</w:t>
+      </w:r>
+      <w:r>
+        <w:rPr>
+          <w:rFonts w:hint="eastAsia"/>
+          <w:b/>
+          <w:bCs/>
+        </w:rPr>
+        <w:t>でJSONかCSVへ保存することを想定しています。</w:t>
+      </w:r>
+    </w:p>
+    <w:p>
+      <w:pPr>
+        <w:pStyle w:val="a9"/>
+        <w:snapToGrid w:val="0"/>
+        <w:ind w:left="360"/>
+        <w:rPr>
+          <w:b/>
+          <w:bCs/>
+        </w:rPr>
+      </w:pPr>
+      <w:r>
+        <w:rPr>
+          <w:rFonts w:hint="eastAsia"/>
+          <w:b/>
+          <w:bCs/>
+        </w:rPr>
+        <w:t>簡易的なアスキーアートで実装イメージを教えてください。</w:t>
+      </w:r>
+    </w:p>
+    <w:p>
+      <w:pPr>
+        <w:pStyle w:val="a9"/>
+        <w:snapToGrid w:val="0"/>
+        <w:ind w:left="360"/>
+        <w:rPr>
+          <w:b/>
+          <w:bCs/>
+        </w:rPr>
+      </w:pPr>
+      <w:r>
+        <w:rPr>
+          <w:b/>
+          <w:bCs/>
+        </w:rPr>
+        <w:t>**まだ実装はせず見解のみを教えて下さい**</w:t>
+      </w:r>
+    </w:p>
+    <w:p>
+      <w:pPr>
+        <w:pStyle w:val="a9"/>
+        <w:pBdr>
+          <w:bottom w:val="single" w:sz="6" w:space="1" w:color="auto"/>
+        </w:pBdr>
+        <w:snapToGrid w:val="0"/>
+        <w:ind w:left="360"/>
+        <w:rPr>
+          <w:b/>
+          <w:bCs/>
+        </w:rPr>
+      </w:pPr>
+    </w:p>
+    <w:p>
+      <w:pPr>
+        <w:pStyle w:val="a9"/>
+        <w:snapToGrid w:val="0"/>
+        <w:ind w:left="360"/>
+        <w:rPr>
+          <w:b/>
+          <w:bCs/>
+        </w:rPr>
+      </w:pPr>
+      <w:r>
+        <w:rPr>
+          <w:rFonts w:hint="eastAsia"/>
+          <w:b/>
+          <w:bCs/>
+        </w:rPr>
+        <w:t>「</w:t>
+      </w:r>
+      <w:r>
+        <w:rPr>
+          <w:rFonts w:hint="eastAsia"/>
+          <w:b/>
+          <w:bCs/>
+        </w:rPr>
+        <w:t>カスタム属性</w:t>
+      </w:r>
+      <w:r>
+        <w:rPr>
+          <w:rFonts w:hint="eastAsia"/>
+          <w:b/>
+          <w:bCs/>
+        </w:rPr>
+        <w:t>」部分について、単純にメモエリアのみとしてください。段階的に構造化するかもしれませんが当面は自由記述欄だけで十分です。</w:t>
+      </w:r>
+    </w:p>
+    <w:p>
+      <w:pPr>
+        <w:pStyle w:val="a9"/>
+        <w:pBdr>
+          <w:bottom w:val="single" w:sz="6" w:space="1" w:color="auto"/>
+        </w:pBdr>
+        <w:snapToGrid w:val="0"/>
+        <w:ind w:left="360"/>
+        <w:rPr>
+          <w:b/>
+          <w:bCs/>
+        </w:rPr>
+      </w:pPr>
+    </w:p>
+    <w:p>
+      <w:pPr>
+        <w:pStyle w:val="a9"/>
+        <w:snapToGrid w:val="0"/>
+        <w:ind w:left="360"/>
+        <w:rPr>
+          <w:b/>
+          <w:bCs/>
+        </w:rPr>
+      </w:pPr>
+      <w:r>
+        <w:rPr>
+          <w:rFonts w:hint="eastAsia"/>
+          <w:b/>
+          <w:bCs/>
+        </w:rPr>
+        <w:t>上記実装前に教えてください。</w:t>
+      </w:r>
+    </w:p>
+    <w:p>
+      <w:pPr>
+        <w:pStyle w:val="a9"/>
+        <w:snapToGrid w:val="0"/>
+        <w:ind w:left="360"/>
+        <w:rPr>
+          <w:b/>
+          <w:bCs/>
+        </w:rPr>
+      </w:pPr>
+      <w:r>
+        <w:rPr>
+          <w:rFonts w:hint="eastAsia"/>
+          <w:b/>
+          <w:bCs/>
+        </w:rPr>
+        <w:t>現在「要素情報」に「ピン留め」「更新」ボタンがありますが意味ありますか？</w:t>
+      </w:r>
+    </w:p>
+    <w:p>
+      <w:pPr>
+        <w:pStyle w:val="a9"/>
+        <w:snapToGrid w:val="0"/>
+        <w:ind w:left="360"/>
+        <w:rPr>
+          <w:b/>
+          <w:bCs/>
+        </w:rPr>
+      </w:pPr>
+      <w:r>
+        <w:rPr>
+          <w:rFonts w:hint="eastAsia"/>
+          <w:b/>
+          <w:bCs/>
+        </w:rPr>
+        <w:t>現在要素情報画面はマウスで移動した位置に固定されているため特にピン留めで明示的に固定する必要もないと思いますがいかがですか？</w:t>
+      </w:r>
+    </w:p>
+    <w:p>
+      <w:pPr>
+        <w:pStyle w:val="a9"/>
+        <w:snapToGrid w:val="0"/>
+        <w:ind w:left="360"/>
+        <w:rPr>
+          <w:b/>
+          <w:bCs/>
+        </w:rPr>
+      </w:pPr>
+      <w:r>
+        <w:rPr>
+          <w:rFonts w:hint="eastAsia"/>
+          <w:b/>
+          <w:bCs/>
+        </w:rPr>
+        <w:t>更新ボタンも、例えばメモを記述したら即座に</w:t>
+      </w:r>
+      <w:r>
+        <w:rPr>
+          <w:rFonts w:hint="eastAsia"/>
+          <w:b/>
+          <w:bCs/>
+        </w:rPr>
+        <w:t>「</w:t>
+      </w:r>
+      <w:r>
+        <w:rPr>
+          <w:b/>
+          <w:bCs/>
+        </w:rPr>
+        <w:t>File System Access API」</w:t>
+      </w:r>
+      <w:r>
+        <w:rPr>
+          <w:rFonts w:hint="eastAsia"/>
+          <w:b/>
+          <w:bCs/>
+        </w:rPr>
+        <w:t>であらかじめユーザーが指定したファイルへ保存される仕様としたら不要ですよね？この２つのボタンをなくしてフッター部分を要素情報表示エリアとして広げたほうがメリットが多い気がしますがいかがですか？</w:t>
+      </w:r>
+    </w:p>
+    <w:p>
+      <w:pPr>
+        <w:pStyle w:val="a9"/>
+        <w:snapToGrid w:val="0"/>
+        <w:ind w:left="360"/>
+        <w:rPr>
+          <w:b/>
+          <w:bCs/>
+        </w:rPr>
+      </w:pPr>
+    </w:p>
+    <w:p>
+      <w:pPr>
+        <w:pStyle w:val="a9"/>
+        <w:pBdr>
+          <w:bottom w:val="single" w:sz="6" w:space="1" w:color="auto"/>
+        </w:pBdr>
+        <w:snapToGrid w:val="0"/>
+        <w:ind w:left="360"/>
+        <w:rPr>
+          <w:b/>
+          <w:bCs/>
+        </w:rPr>
+      </w:pPr>
+    </w:p>
+    <w:p>
+      <w:pPr>
+        <w:pStyle w:val="a9"/>
+        <w:snapToGrid w:val="0"/>
+        <w:ind w:left="360"/>
+        <w:rPr>
+          <w:b/>
+          <w:bCs/>
+        </w:rPr>
+      </w:pPr>
+      <w:r>
+        <w:rPr>
+          <w:rFonts w:hint="eastAsia"/>
+          <w:b/>
+          <w:bCs/>
+        </w:rPr>
+        <w:t>要素情報のメモ部分がグレーアウトして記述できません。</w:t>
+      </w:r>
+    </w:p>
+    <w:p>
+      <w:pPr>
+        <w:pStyle w:val="a9"/>
+        <w:snapToGrid w:val="0"/>
+        <w:ind w:left="360"/>
+        <w:rPr>
+          <w:b/>
+          <w:bCs/>
+        </w:rPr>
+      </w:pPr>
+    </w:p>
+    <w:p>
+      <w:pPr>
+        <w:pStyle w:val="a9"/>
+        <w:pBdr>
+          <w:bottom w:val="single" w:sz="6" w:space="1" w:color="auto"/>
+        </w:pBdr>
+        <w:snapToGrid w:val="0"/>
+        <w:ind w:left="360"/>
+        <w:rPr>
+          <w:b/>
+          <w:bCs/>
+        </w:rPr>
+      </w:pPr>
+    </w:p>
+    <w:p>
+      <w:pPr>
+        <w:pStyle w:val="a9"/>
+        <w:snapToGrid w:val="0"/>
+        <w:ind w:left="360"/>
+        <w:rPr>
+          <w:b/>
+          <w:bCs/>
+        </w:rPr>
+      </w:pPr>
+      <w:r>
+        <w:rPr>
+          <w:rFonts w:hint="eastAsia"/>
+          <w:b/>
+          <w:bCs/>
+        </w:rPr>
+        <w:t>ノードにメモができるようになりましたが、なぜか要素情報画面のヘッダーに選択したラベル名が表示されます。</w:t>
+      </w:r>
+    </w:p>
+    <w:p>
+      <w:pPr>
+        <w:pStyle w:val="a9"/>
+        <w:snapToGrid w:val="0"/>
+        <w:ind w:left="360"/>
+        <w:rPr>
+          <w:b/>
+          <w:bCs/>
+        </w:rPr>
+      </w:pPr>
+      <w:r>
+        <w:rPr>
+          <w:rFonts w:hint="eastAsia"/>
+          <w:b/>
+          <w:bCs/>
+        </w:rPr>
+        <w:t>また、特定のノードを選択している状況でマウスを他の要素へホバーするとその内容が要素情報に表示されてしまうため、特定のノードを選択している場合は他の要素をマウスホバーしても選択した要素の情報のみを要素情報画面に表示させたいのですがいかがですか？</w:t>
+      </w:r>
+    </w:p>
+    <w:p>
+      <w:pPr>
+        <w:pStyle w:val="a9"/>
+        <w:snapToGrid w:val="0"/>
+        <w:ind w:left="360"/>
+        <w:rPr>
+          <w:b/>
+          <w:bCs/>
+        </w:rPr>
+      </w:pPr>
+      <w:r>
+        <w:rPr>
+          <w:b/>
+          <w:bCs/>
+        </w:rPr>
+        <w:t>**まだ実装はせず見解のみを教えて下さい**</w:t>
+      </w:r>
+    </w:p>
+    <w:p>
+      <w:pPr>
+        <w:pStyle w:val="a9"/>
+        <w:pBdr>
+          <w:bottom w:val="single" w:sz="6" w:space="1" w:color="auto"/>
+        </w:pBdr>
+        <w:snapToGrid w:val="0"/>
+        <w:ind w:left="360"/>
+        <w:rPr>
+          <w:b/>
+          <w:bCs/>
+        </w:rPr>
+      </w:pPr>
+    </w:p>
+    <w:p>
+      <w:pPr>
+        <w:pStyle w:val="a9"/>
+        <w:snapToGrid w:val="0"/>
+        <w:ind w:left="360"/>
+        <w:rPr>
+          <w:b/>
+          <w:bCs/>
+        </w:rPr>
+      </w:pPr>
+      <w:r>
+        <w:rPr>
+          <w:rFonts w:hint="eastAsia"/>
+          <w:b/>
+          <w:bCs/>
+        </w:rPr>
+        <w:t>ツールチップ（小さいポップアップ）</w:t>
+      </w:r>
+      <w:r>
+        <w:rPr>
+          <w:rFonts w:hint="eastAsia"/>
+          <w:b/>
+          <w:bCs/>
+        </w:rPr>
+        <w:t>とはどの事を言っていますか？ツールチップは以前廃止して現状の任意移動小画面の要素情報にしましたよね？それとは別のなにかですか？私はそれがみえないのですが</w:t>
+      </w:r>
+    </w:p>
+    <w:p>
+      <w:pPr>
+        <w:pStyle w:val="a9"/>
+        <w:pBdr>
+          <w:bottom w:val="single" w:sz="6" w:space="1" w:color="auto"/>
+        </w:pBdr>
+        <w:snapToGrid w:val="0"/>
+        <w:ind w:left="360"/>
+        <w:rPr>
+          <w:b/>
+          <w:bCs/>
+        </w:rPr>
+      </w:pPr>
+    </w:p>
+    <w:p>
+      <w:pPr>
+        <w:pStyle w:val="a9"/>
+        <w:snapToGrid w:val="0"/>
+        <w:ind w:left="360"/>
+        <w:rPr>
+          <w:b/>
+          <w:bCs/>
+        </w:rPr>
+      </w:pPr>
+      <w:r>
+        <w:rPr>
+          <w:rFonts w:hint="eastAsia"/>
+          <w:b/>
+          <w:bCs/>
+        </w:rPr>
+        <w:t>要素情報画面のヘッダーに選択したラベル名が表示され</w:t>
+      </w:r>
+      <w:r>
+        <w:rPr>
+          <w:rFonts w:hint="eastAsia"/>
+          <w:b/>
+          <w:bCs/>
+        </w:rPr>
+        <w:t>る仕様は不要なのですが廃止できますか？</w:t>
+      </w:r>
+    </w:p>
+    <w:p>
+      <w:pPr>
+        <w:pStyle w:val="a9"/>
+        <w:snapToGrid w:val="0"/>
+        <w:ind w:left="360"/>
+        <w:rPr>
+          <w:b/>
+          <w:bCs/>
+        </w:rPr>
+      </w:pPr>
+    </w:p>
+    <w:p>
+      <w:pPr>
+        <w:pStyle w:val="a9"/>
+        <w:pBdr>
+          <w:bottom w:val="single" w:sz="6" w:space="1" w:color="auto"/>
+        </w:pBdr>
+        <w:snapToGrid w:val="0"/>
+        <w:ind w:left="360"/>
+        <w:rPr>
+          <w:b/>
+          <w:bCs/>
+        </w:rPr>
+      </w:pPr>
+    </w:p>
+    <w:p>
+      <w:pPr>
+        <w:pStyle w:val="a9"/>
+        <w:snapToGrid w:val="0"/>
+        <w:ind w:left="360"/>
+        <w:rPr>
+          <w:b/>
+          <w:bCs/>
+        </w:rPr>
+      </w:pPr>
+    </w:p>
+    <w:p>
+      <w:pPr>
+        <w:pStyle w:val="a9"/>
+        <w:snapToGrid w:val="0"/>
+        <w:ind w:left="360"/>
+        <w:rPr>
+          <w:b/>
+          <w:bCs/>
+        </w:rPr>
+      </w:pPr>
+      <w:r>
+        <w:rPr>
+          <w:rFonts w:hint="eastAsia"/>
+          <w:b/>
+          <w:bCs/>
+        </w:rPr>
+        <w:t>解決しました。</w:t>
+      </w:r>
+      <w:r>
+        <w:rPr>
+          <w:rFonts w:hint="eastAsia"/>
+          <w:b/>
+          <w:bCs/>
+        </w:rPr>
+        <w:t>デバッグ用の</w:t>
+      </w:r>
+      <w:r>
+        <w:rPr>
+          <w:b/>
+          <w:bCs/>
+        </w:rPr>
+        <w:t>console.logを削除</w:t>
+      </w:r>
+      <w:r>
+        <w:rPr>
+          <w:rFonts w:hint="eastAsia"/>
+          <w:b/>
+          <w:bCs/>
+        </w:rPr>
+        <w:t>してください。</w:t>
+      </w:r>
+    </w:p>
+    <w:p>
+      <w:pPr>
+        <w:pStyle w:val="a9"/>
+        <w:snapToGrid w:val="0"/>
+        <w:ind w:left="360"/>
+        <w:rPr>
+          <w:b/>
+          <w:bCs/>
+        </w:rPr>
+      </w:pPr>
+    </w:p>
+    <w:p>
+      <w:pPr>
+        <w:pStyle w:val="a9"/>
+        <w:snapToGrid w:val="0"/>
+        <w:ind w:left="360"/>
+        <w:rPr>
+          <w:b/>
+          <w:bCs/>
+        </w:rPr>
+      </w:pPr>
+      <w:r>
+        <w:rPr>
+          <w:rFonts w:hint="eastAsia"/>
+          <w:b/>
+          <w:bCs/>
+        </w:rPr>
+        <w:t>次に、エッジ/エッジラベルを選択できない問題を精査してください。</w:t>
+      </w:r>
+    </w:p>
+    <w:p>
+      <w:pPr>
+        <w:pStyle w:val="a9"/>
+        <w:snapToGrid w:val="0"/>
+        <w:ind w:left="360"/>
+        <w:rPr>
+          <w:b/>
+          <w:bCs/>
+        </w:rPr>
+      </w:pPr>
+      <w:r>
+        <w:rPr>
+          <w:rFonts w:hint="eastAsia"/>
+          <w:b/>
+          <w:bCs/>
+        </w:rPr>
+        <w:t>もしかしたらサブグラフの裏側になっていて選択できないとかないですよね？</w:t>
+      </w:r>
+    </w:p>
+    <w:p>
+      <w:pPr>
+        <w:pStyle w:val="a9"/>
+        <w:snapToGrid w:val="0"/>
+        <w:ind w:left="360"/>
+        <w:rPr>
+          <w:b/>
+          <w:bCs/>
+        </w:rPr>
+      </w:pPr>
+      <w:r>
+        <w:rPr>
+          <w:rFonts w:hint="eastAsia"/>
+          <w:b/>
+          <w:bCs/>
+        </w:rPr>
+        <w:t>そうなるとMermaidからSVGへの変換過程に問題があることになりおそらく修正が難しい可能性があります。</w:t>
+      </w:r>
+    </w:p>
+    <w:p>
+      <w:pPr>
+        <w:pStyle w:val="a9"/>
+        <w:snapToGrid w:val="0"/>
+        <w:ind w:left="360"/>
+        <w:rPr>
+          <w:b/>
+          <w:bCs/>
+        </w:rPr>
+      </w:pPr>
+    </w:p>
+    <w:p>
+      <w:pPr>
+        <w:pStyle w:val="a9"/>
+        <w:pBdr>
+          <w:bottom w:val="single" w:sz="6" w:space="1" w:color="auto"/>
+        </w:pBdr>
+        <w:snapToGrid w:val="0"/>
+        <w:ind w:left="360"/>
+        <w:rPr>
+          <w:b/>
+          <w:bCs/>
+        </w:rPr>
+      </w:pPr>
+    </w:p>
+    <w:p>
+      <w:pPr>
+        <w:pStyle w:val="a9"/>
+        <w:snapToGrid w:val="0"/>
+        <w:ind w:left="360"/>
+        <w:rPr>
+          <w:b/>
+          <w:bCs/>
+        </w:rPr>
+      </w:pPr>
+      <w:r>
+        <w:rPr>
+          <w:rFonts w:hint="eastAsia"/>
+          <w:b/>
+          <w:bCs/>
+        </w:rPr>
+        <w:t>SVGを拡大したらエッジを選択できました。</w:t>
+      </w:r>
+    </w:p>
+    <w:p>
+      <w:pPr>
+        <w:pStyle w:val="a9"/>
+        <w:snapToGrid w:val="0"/>
+        <w:ind w:left="360"/>
+        <w:rPr>
+          <w:b/>
+          <w:bCs/>
+        </w:rPr>
+      </w:pPr>
+    </w:p>
+    <w:p>
+      <w:pPr>
+        <w:pStyle w:val="a9"/>
+        <w:snapToGrid w:val="0"/>
+        <w:ind w:left="360"/>
+        <w:rPr>
+          <w:b/>
+          <w:bCs/>
+        </w:rPr>
+      </w:pPr>
+      <w:r>
+        <w:rPr>
+          <w:rFonts w:hint="eastAsia"/>
+          <w:b/>
+          <w:bCs/>
+        </w:rPr>
+        <w:t>次に、贅沢かもしれませんが、ミニマップ操作による実画面移動をスムーズにできませんか？現状</w:t>
+      </w:r>
+      <w:r>
+        <w:rPr>
+          <w:rFonts w:hint="eastAsia"/>
+          <w:b/>
+          <w:bCs/>
+        </w:rPr>
+        <w:t>カクカクしています。しかたないといえばしかたないですが。</w:t>
+      </w:r>
+    </w:p>
+    <w:p>
+      <w:pPr>
+        <w:pStyle w:val="a9"/>
+        <w:snapToGrid w:val="0"/>
+        <w:ind w:left="360"/>
+        <w:rPr>
+          <w:b/>
+          <w:bCs/>
+        </w:rPr>
+      </w:pPr>
+    </w:p>
+    <w:p>
+      <w:pPr>
+        <w:pStyle w:val="a9"/>
+        <w:snapToGrid w:val="0"/>
+        <w:ind w:left="360"/>
+        <w:rPr>
+          <w:b/>
+          <w:bCs/>
+        </w:rPr>
+      </w:pPr>
+      <w:r>
+        <w:rPr>
+          <w:b/>
+          <w:bCs/>
+        </w:rPr>
+        <w:t>**まだ実装はせず見解のみを教えて下さい**</w:t>
+      </w:r>
+    </w:p>
+    <w:p>
+      <w:pPr>
+        <w:pStyle w:val="a9"/>
+        <w:snapToGrid w:val="0"/>
+        <w:ind w:left="360"/>
+        <w:rPr>
+          <w:b/>
+          <w:bCs/>
+        </w:rPr>
+      </w:pPr>
+    </w:p>
+    <w:p>
+      <w:pPr>
+        <w:pStyle w:val="a9"/>
+        <w:pBdr>
+          <w:bottom w:val="single" w:sz="6" w:space="1" w:color="auto"/>
+        </w:pBdr>
+        <w:snapToGrid w:val="0"/>
+        <w:ind w:left="360"/>
+        <w:rPr>
+          <w:b/>
+          <w:bCs/>
+        </w:rPr>
+      </w:pPr>
+    </w:p>
+    <w:p>
+      <w:pPr>
+        <w:pStyle w:val="a9"/>
+        <w:snapToGrid w:val="0"/>
+        <w:ind w:left="360"/>
+        <w:rPr>
+          <w:b/>
+          <w:bCs/>
+        </w:rPr>
+      </w:pPr>
+      <w:r>
+        <w:rPr>
+          <w:rFonts w:hint="eastAsia"/>
+          <w:b/>
+          <w:bCs/>
+        </w:rPr>
+        <w:t>何度も言いますがこのHTMLファイル閲覧・操作環境は</w:t>
+      </w:r>
+      <w:proofErr w:type="spellStart"/>
+      <w:r>
+        <w:rPr>
+          <w:rFonts w:hint="eastAsia"/>
+          <w:b/>
+          <w:bCs/>
+        </w:rPr>
+        <w:t>Javascript</w:t>
+      </w:r>
+      <w:proofErr w:type="spellEnd"/>
+      <w:r>
+        <w:rPr>
+          <w:rFonts w:hint="eastAsia"/>
+          <w:b/>
+          <w:bCs/>
+        </w:rPr>
+        <w:t>・Python・CSS等の外部ライブラリを利用できません。上記案はEdgeの標準環境で利用できるのですか？</w:t>
+      </w:r>
+    </w:p>
+    <w:p>
+      <w:pPr>
+        <w:pStyle w:val="a9"/>
+        <w:snapToGrid w:val="0"/>
+        <w:ind w:left="360"/>
+        <w:rPr>
+          <w:b/>
+          <w:bCs/>
+        </w:rPr>
+      </w:pPr>
+    </w:p>
+    <w:p>
+      <w:pPr>
+        <w:pStyle w:val="a9"/>
+        <w:pBdr>
+          <w:bottom w:val="single" w:sz="6" w:space="1" w:color="auto"/>
+        </w:pBdr>
+        <w:snapToGrid w:val="0"/>
+        <w:ind w:left="360"/>
+        <w:rPr>
+          <w:b/>
+          <w:bCs/>
+        </w:rPr>
+      </w:pPr>
+    </w:p>
+    <w:p>
+      <w:pPr>
+        <w:pStyle w:val="a9"/>
+        <w:snapToGrid w:val="0"/>
+        <w:ind w:left="360"/>
+        <w:rPr>
+          <w:b/>
+          <w:bCs/>
+        </w:rPr>
+      </w:pPr>
+      <w:r>
+        <w:rPr>
+          <w:rFonts w:hint="eastAsia"/>
+          <w:b/>
+          <w:bCs/>
+        </w:rPr>
+        <w:t>多少スムーズになりましたがミニマップ上で矩形をドラッグ移動できなくなってしまいました。ドラッグ移動できないほうが問題です。</w:t>
+      </w:r>
+    </w:p>
+    <w:p>
+      <w:pPr>
+        <w:pStyle w:val="a9"/>
+        <w:snapToGrid w:val="0"/>
+        <w:ind w:left="360"/>
+        <w:rPr>
+          <w:rFonts w:hint="eastAsia"/>
+          <w:b/>
+          <w:bCs/>
+        </w:rPr>
+      </w:pPr>
+    </w:p>
+    <w:p>
+      <w:pPr>
+        <w:pStyle w:val="a9"/>
+        <w:snapToGrid w:val="0"/>
+        <w:ind w:left="360"/>
+        <w:rPr>
+          <w:b/>
+          <w:bCs/>
+        </w:rPr>
+      </w:pPr>
+      <w:r>
+        <w:rPr>
+          <w:rFonts w:hint="eastAsia"/>
+          <w:b/>
+          <w:bCs/>
+        </w:rPr>
+        <w:t>もとに戻りましたね。ミニマップ上の矩形移動時に実画面移動がカクつきます。Edgeの標準機能でなんとかなりませんか？</w:t>
+      </w:r>
+    </w:p>
+    <w:p>
+      <w:pPr>
+        <w:pStyle w:val="a9"/>
+        <w:snapToGrid w:val="0"/>
+        <w:ind w:left="360"/>
+        <w:rPr>
+          <w:b/>
+          <w:bCs/>
+        </w:rPr>
+      </w:pPr>
+    </w:p>
+    <w:p>
+      <w:pPr>
+        <w:pStyle w:val="a9"/>
+        <w:pBdr>
+          <w:bottom w:val="single" w:sz="6" w:space="1" w:color="auto"/>
+        </w:pBdr>
+        <w:snapToGrid w:val="0"/>
+        <w:ind w:left="360"/>
+        <w:rPr>
+          <w:b/>
+          <w:bCs/>
+        </w:rPr>
+      </w:pPr>
+    </w:p>
+    <w:p>
+      <w:pPr>
+        <w:pStyle w:val="a9"/>
+        <w:snapToGrid w:val="0"/>
+        <w:ind w:left="360"/>
+        <w:rPr>
+          <w:b/>
+          <w:bCs/>
+        </w:rPr>
+      </w:pPr>
+      <w:r>
+        <w:rPr>
+          <w:rFonts w:hint="eastAsia"/>
+          <w:b/>
+          <w:bCs/>
+        </w:rPr>
+        <w:t>もうすこしスムーズになりませんかね？</w:t>
+      </w:r>
+    </w:p>
+    <w:p>
+      <w:pPr>
+        <w:pStyle w:val="a9"/>
+        <w:snapToGrid w:val="0"/>
+        <w:ind w:left="360"/>
+        <w:rPr>
+          <w:b/>
+          <w:bCs/>
+        </w:rPr>
+      </w:pPr>
+    </w:p>
+    <w:p>
+      <w:pPr>
+        <w:pStyle w:val="a9"/>
+        <w:pBdr>
+          <w:bottom w:val="single" w:sz="6" w:space="1" w:color="auto"/>
+        </w:pBdr>
+        <w:snapToGrid w:val="0"/>
+        <w:ind w:left="360"/>
+        <w:rPr>
+          <w:b/>
+          <w:bCs/>
+        </w:rPr>
+      </w:pPr>
+    </w:p>
+    <w:p>
+      <w:pPr>
+        <w:pStyle w:val="a9"/>
+        <w:snapToGrid w:val="0"/>
+        <w:ind w:left="360"/>
+        <w:rPr>
+          <w:b/>
+          <w:bCs/>
+        </w:rPr>
+      </w:pPr>
+      <w:r>
+        <w:rPr>
+          <w:rFonts w:hint="eastAsia"/>
+          <w:b/>
+          <w:bCs/>
+        </w:rPr>
+        <w:t>ここまでSVGで色々できるなら、SVGのノードやエッジラベル等のラベルテキストを要素情報画面で編集できないものですかね？</w:t>
+      </w:r>
+    </w:p>
+    <w:p>
+      <w:pPr>
+        <w:pStyle w:val="a9"/>
+        <w:snapToGrid w:val="0"/>
+        <w:ind w:left="360"/>
+        <w:rPr>
+          <w:b/>
+          <w:bCs/>
+        </w:rPr>
+      </w:pPr>
+      <w:r>
+        <w:rPr>
+          <w:b/>
+          <w:bCs/>
+        </w:rPr>
+        <w:t>**まだ実装はせず見解のみを教えて下さい**</w:t>
+      </w:r>
+    </w:p>
+    <w:p>
+      <w:pPr>
+        <w:pStyle w:val="a9"/>
+        <w:pBdr>
+          <w:bottom w:val="single" w:sz="6" w:space="1" w:color="auto"/>
+        </w:pBdr>
+        <w:snapToGrid w:val="0"/>
+        <w:ind w:left="360"/>
+        <w:rPr>
+          <w:b/>
+          <w:bCs/>
+        </w:rPr>
+      </w:pPr>
+    </w:p>
+    <w:p>
+      <w:pPr>
+        <w:pStyle w:val="a9"/>
+        <w:snapToGrid w:val="0"/>
+        <w:ind w:left="360"/>
+        <w:rPr>
+          <w:b/>
+          <w:bCs/>
+        </w:rPr>
+      </w:pPr>
+      <w:r>
+        <w:rPr>
+          <w:rFonts w:hint="eastAsia"/>
+          <w:b/>
+          <w:bCs/>
+        </w:rPr>
+        <w:t>概ね上記方針でよいですが、「</w:t>
+      </w:r>
+      <w:r>
+        <w:rPr>
+          <w:b/>
+          <w:bCs/>
+        </w:rPr>
+        <w:t>「編集済みSVGとしてエクスポート」機能</w:t>
+      </w:r>
+      <w:r>
+        <w:rPr>
+          <w:rFonts w:hint="eastAsia"/>
+          <w:b/>
+          <w:bCs/>
+        </w:rPr>
+        <w:t>」を実装したとして、そこでエクスポートしたSVGを本ツールで読み込めるのですか？</w:t>
+      </w:r>
+      <w:r>
+        <w:rPr>
+          <w:b/>
+          <w:bCs/>
+        </w:rPr>
+        <w:t>**まだ実装はせず見解のみを教えて下さい**</w:t>
+      </w:r>
+    </w:p>
+    <w:p>
+      <w:pPr>
+        <w:pStyle w:val="a9"/>
+        <w:pBdr>
+          <w:bottom w:val="single" w:sz="6" w:space="1" w:color="auto"/>
+        </w:pBdr>
+        <w:snapToGrid w:val="0"/>
+        <w:ind w:left="360"/>
+        <w:rPr>
+          <w:b/>
+          <w:bCs/>
+        </w:rPr>
+      </w:pPr>
+    </w:p>
+    <w:p>
+      <w:pPr>
+        <w:pStyle w:val="a9"/>
+        <w:snapToGrid w:val="0"/>
+        <w:ind w:left="360"/>
+        <w:rPr>
+          <w:b/>
+          <w:bCs/>
+        </w:rPr>
+      </w:pPr>
+      <w:r>
+        <w:rPr>
+          <w:rFonts w:hint="eastAsia"/>
+          <w:b/>
+          <w:bCs/>
+        </w:rPr>
+        <w:t>ここまでくると、逆にSVGの特定のノードを削除したり追加したりノード同士をエッジでつなぐなどもできるのではないのですか？</w:t>
+      </w:r>
+    </w:p>
+    <w:p>
+      <w:pPr>
+        <w:pStyle w:val="a9"/>
+        <w:snapToGrid w:val="0"/>
+        <w:ind w:left="360"/>
+        <w:rPr>
+          <w:rFonts w:hint="eastAsia"/>
+          <w:b/>
+          <w:bCs/>
+        </w:rPr>
+      </w:pPr>
+      <w:r>
+        <w:rPr>
+          <w:rFonts w:hint="eastAsia"/>
+          <w:b/>
+          <w:bCs/>
+        </w:rPr>
+        <w:t>また、既表示のノードと同様な拡大縮小表示される付箋のようなどこにも接続していないノードをランダムに配置して他のノードとエッジで接続できると相当革新的です。さらにはエッジラベルまで貼れたら相当素晴らしいですが難しいですかね？</w:t>
+      </w:r>
+    </w:p>
+    <w:p>
+      <w:pPr>
+        <w:pStyle w:val="a9"/>
+        <w:snapToGrid w:val="0"/>
+        <w:ind w:left="360"/>
+        <w:rPr>
+          <w:b/>
+          <w:bCs/>
+        </w:rPr>
+      </w:pPr>
+      <w:r>
+        <w:rPr>
+          <w:rFonts w:hint="eastAsia"/>
+          <w:b/>
+          <w:bCs/>
+        </w:rPr>
+        <w:t>本用途として会議の中でフローチャートを修正するようなメモ書き程度の柔軟なフローチャート編集用途を想定しています。</w:t>
+      </w:r>
+    </w:p>
+    <w:p>
+      <w:pPr>
+        <w:pStyle w:val="a9"/>
+        <w:snapToGrid w:val="0"/>
+        <w:ind w:left="360"/>
+        <w:rPr>
+          <w:b/>
+          <w:bCs/>
+        </w:rPr>
+      </w:pPr>
+      <w:r>
+        <w:rPr>
+          <w:rFonts w:hint="eastAsia"/>
+          <w:b/>
+          <w:bCs/>
+        </w:rPr>
+        <w:t>私の意見に依存せず客観的見解を教えて下さい。</w:t>
+      </w:r>
+    </w:p>
+    <w:p>
+      <w:pPr>
+        <w:pStyle w:val="a9"/>
+        <w:pBdr>
+          <w:bottom w:val="single" w:sz="6" w:space="1" w:color="auto"/>
+        </w:pBdr>
+        <w:snapToGrid w:val="0"/>
+        <w:ind w:left="360"/>
+        <w:rPr>
+          <w:b/>
+          <w:bCs/>
+        </w:rPr>
+      </w:pPr>
+      <w:r>
+        <w:rPr>
+          <w:b/>
+          <w:bCs/>
+        </w:rPr>
+        <w:t>**まだ実装はせず見解のみを教えて下さい**</w:t>
+      </w:r>
+    </w:p>
+    <w:p>
+      <w:pPr>
+        <w:pStyle w:val="a9"/>
+        <w:snapToGrid w:val="0"/>
+        <w:ind w:left="360"/>
+        <w:rPr>
+          <w:b/>
+          <w:bCs/>
+        </w:rPr>
+      </w:pPr>
+      <w:r>
+        <w:rPr>
+          <w:rFonts w:hint="eastAsia"/>
+          <w:b/>
+          <w:bCs/>
+        </w:rPr>
+        <w:t>状況を理解しました。</w:t>
+      </w:r>
+      <w:r>
+        <w:rPr>
+          <w:rFonts w:hint="eastAsia"/>
+          <w:b/>
+          <w:bCs/>
+        </w:rPr>
+        <w:t>Mermaidのように</w:t>
+      </w:r>
+      <w:r>
+        <w:rPr>
+          <w:rFonts w:hint="eastAsia"/>
+          <w:b/>
+          <w:bCs/>
+        </w:rPr>
+        <w:t>きれいに</w:t>
+      </w:r>
+      <w:r>
+        <w:rPr>
+          <w:rFonts w:hint="eastAsia"/>
+          <w:b/>
+          <w:bCs/>
+        </w:rPr>
+        <w:t>論理的なノード間を</w:t>
+      </w:r>
+      <w:r>
+        <w:rPr>
+          <w:rFonts w:hint="eastAsia"/>
+          <w:b/>
+          <w:bCs/>
+        </w:rPr>
+        <w:t>接続するエッジではなく、単にマウスで指定した位置から指定した位置までの線を</w:t>
+      </w:r>
+      <w:r>
+        <w:rPr>
+          <w:rFonts w:hint="eastAsia"/>
+          <w:b/>
+          <w:bCs/>
+        </w:rPr>
+        <w:t>配置（画面の拡大縮小に応じて他の要素のように自然な見え方にする必要はある）する完全にメモ書き程度の配置ならできますか？</w:t>
+      </w:r>
+    </w:p>
+    <w:p>
+      <w:pPr>
+        <w:pStyle w:val="a9"/>
+        <w:snapToGrid w:val="0"/>
+        <w:ind w:left="360"/>
+        <w:rPr>
+          <w:b/>
+          <w:bCs/>
+        </w:rPr>
+      </w:pPr>
+      <w:r>
+        <w:rPr>
+          <w:rFonts w:hint="eastAsia"/>
+          <w:b/>
+          <w:bCs/>
+        </w:rPr>
+        <w:t>簡易的なアスキーアートで実装イメージを教えてください。</w:t>
+      </w:r>
+    </w:p>
+    <w:p>
+      <w:pPr>
+        <w:pStyle w:val="a9"/>
+        <w:snapToGrid w:val="0"/>
+        <w:ind w:left="360"/>
+        <w:rPr>
+          <w:rFonts w:hint="eastAsia"/>
+          <w:b/>
+          <w:bCs/>
+        </w:rPr>
+      </w:pPr>
+      <w:r>
+        <w:rPr>
+          <w:b/>
+          <w:bCs/>
+        </w:rPr>
+        <w:t>**まだ実装はせず見解のみを教えて下さい**</w:t>
+      </w:r>
+    </w:p>
+    <w:p>
+      <w:pPr>
+        <w:pStyle w:val="a9"/>
+        <w:snapToGrid w:val="0"/>
+        <w:ind w:left="360"/>
+        <w:rPr>
+          <w:b/>
+          <w:bCs/>
+        </w:rPr>
+      </w:pPr>
+    </w:p>
+    <w:p>
+      <w:pPr>
+        <w:pStyle w:val="a9"/>
+        <w:pBdr>
+          <w:top w:val="single" w:sz="6" w:space="1" w:color="auto"/>
+          <w:bottom w:val="single" w:sz="6" w:space="1" w:color="auto"/>
+        </w:pBdr>
+        <w:snapToGrid w:val="0"/>
+        <w:ind w:left="360"/>
+        <w:rPr>
+          <w:b/>
+          <w:bCs/>
+        </w:rPr>
+      </w:pPr>
+    </w:p>
+    <w:p>
+      <w:pPr>
+        <w:pStyle w:val="a9"/>
+        <w:pBdr>
+          <w:bottom w:val="single" w:sz="6" w:space="1" w:color="auto"/>
+        </w:pBdr>
+        <w:snapToGrid w:val="0"/>
+        <w:ind w:left="360"/>
+        <w:rPr>
+          <w:rFonts w:hint="eastAsia"/>
+          <w:b/>
+          <w:bCs/>
+        </w:rPr>
+      </w:pPr>
+      <w:r>
+        <w:rPr>
+          <w:rFonts w:hint="eastAsia"/>
+          <w:b/>
+          <w:bCs/>
+        </w:rPr>
+        <w:t>「</w:t>
+      </w:r>
+      <w:r>
+        <w:rPr>
+          <w:rFonts w:hint="eastAsia"/>
+          <w:b/>
+          <w:bCs/>
+        </w:rPr>
+        <w:t>クリック時にノードの近くなら自動吸着</w:t>
+      </w:r>
+      <w:r>
+        <w:rPr>
+          <w:rFonts w:hint="eastAsia"/>
+          <w:b/>
+          <w:bCs/>
+        </w:rPr>
+        <w:t>」できると素晴らしいです。更にどのメモノードとそのメモエッジが接続しているかをJSONかCSVで出力できれば相当素晴らしいですが、そのような正規のメモではないSVG要素との接続関係までJSONかCSVで構造的に出力させることは可能ですか？</w:t>
+      </w:r>
+    </w:p>
+    <w:p>
+      <w:pPr>
+        <w:pStyle w:val="a9"/>
+        <w:pBdr>
+          <w:bottom w:val="single" w:sz="6" w:space="1" w:color="auto"/>
+        </w:pBdr>
+        <w:snapToGrid w:val="0"/>
+        <w:ind w:left="360"/>
+        <w:rPr>
+          <w:b/>
+          <w:bCs/>
+        </w:rPr>
+      </w:pPr>
+    </w:p>
+    <w:p>
+      <w:pPr>
+        <w:pStyle w:val="a9"/>
+        <w:pBdr>
+          <w:bottom w:val="single" w:sz="6" w:space="1" w:color="auto"/>
+        </w:pBdr>
+        <w:snapToGrid w:val="0"/>
+        <w:ind w:left="360"/>
+        <w:rPr>
+          <w:b/>
+          <w:bCs/>
+        </w:rPr>
+      </w:pPr>
+    </w:p>
+    <w:p>
+      <w:pPr>
+        <w:pStyle w:val="a9"/>
+        <w:pBdr>
+          <w:bottom w:val="single" w:sz="6" w:space="1" w:color="auto"/>
+        </w:pBdr>
+        <w:snapToGrid w:val="0"/>
+        <w:ind w:left="360"/>
+        <w:rPr>
+          <w:rFonts w:hint="eastAsia"/>
+          <w:b/>
+          <w:bCs/>
+        </w:rPr>
+      </w:pPr>
+    </w:p>
+    <w:p>
+      <w:pPr>
+        <w:pStyle w:val="a9"/>
+        <w:snapToGrid w:val="0"/>
+        <w:ind w:left="360"/>
+        <w:rPr>
+          <w:b/>
+          <w:bCs/>
+        </w:rPr>
+      </w:pPr>
+      <w:r>
+        <w:rPr>
+          <w:rFonts w:hint="eastAsia"/>
+          <w:b/>
+          <w:bCs/>
+        </w:rPr>
+        <w:t>エッジ/エッジラベルのマウス選択反応エリアが狭すぎて選択が不便です。なんとかなりませんか？</w:t>
+      </w:r>
+    </w:p>
+    <w:p>
+      <w:pPr>
+        <w:pStyle w:val="a9"/>
+        <w:snapToGrid w:val="0"/>
+        <w:ind w:left="360"/>
+        <w:rPr>
+          <w:b/>
+          <w:bCs/>
+        </w:rPr>
+      </w:pPr>
+    </w:p>
+    <w:p>
+      <w:pPr>
+        <w:pStyle w:val="a9"/>
+        <w:snapToGrid w:val="0"/>
+        <w:ind w:left="360"/>
+        <w:rPr>
+          <w:b/>
+          <w:bCs/>
+        </w:rPr>
+      </w:pPr>
+    </w:p>
+    <w:p>
+      <w:pPr>
+        <w:pStyle w:val="a9"/>
+        <w:snapToGrid w:val="0"/>
+        <w:ind w:left="360"/>
+        <w:rPr>
+          <w:b/>
+          <w:bCs/>
+        </w:rPr>
+      </w:pPr>
+    </w:p>
+    <w:p>
+      <w:pPr>
+        <w:pStyle w:val="a9"/>
+        <w:snapToGrid w:val="0"/>
+        <w:ind w:left="360"/>
+        <w:rPr>
+          <w:rFonts w:hint="eastAsia"/>
+          <w:b/>
+          <w:bCs/>
+        </w:rPr>
+      </w:pPr>
+    </w:p>
+    <w:p>
+      <w:pPr>
+        <w:pStyle w:val="a9"/>
+        <w:pBdr>
+          <w:bottom w:val="single" w:sz="6" w:space="1" w:color="auto"/>
+        </w:pBdr>
+        <w:snapToGrid w:val="0"/>
+        <w:ind w:left="360"/>
+        <w:rPr>
+          <w:b/>
+          <w:bCs/>
+        </w:rPr>
+      </w:pPr>
+    </w:p>
+    <w:p>
+      <w:pPr>
+        <w:pStyle w:val="a9"/>
+        <w:snapToGrid w:val="0"/>
+        <w:ind w:left="360"/>
+        <w:rPr>
+          <w:b/>
+          <w:bCs/>
+        </w:rPr>
+      </w:pPr>
+      <w:r>
+        <w:rPr>
+          <w:rFonts w:hint="eastAsia"/>
+          <w:b/>
+          <w:bCs/>
+        </w:rPr>
+        <w:t>ラベル内容を初期表示に戻すボタンも追加してください</w:t>
+      </w:r>
+    </w:p>
+    <w:p>
+      <w:pPr>
+        <w:pStyle w:val="a9"/>
+        <w:snapToGrid w:val="0"/>
+        <w:ind w:left="360"/>
+        <w:rPr>
+          <w:b/>
+          <w:bCs/>
+        </w:rPr>
+      </w:pPr>
+    </w:p>
+    <w:p>
+      <w:pPr>
+        <w:pStyle w:val="a9"/>
+        <w:snapToGrid w:val="0"/>
+        <w:ind w:left="360"/>
+        <w:rPr>
+          <w:b/>
+          <w:bCs/>
+        </w:rPr>
+      </w:pPr>
+    </w:p>
+    <w:p>
+      <w:pPr>
+        <w:pStyle w:val="a9"/>
+        <w:pBdr>
+          <w:top w:val="single" w:sz="6" w:space="1" w:color="auto"/>
+          <w:bottom w:val="single" w:sz="6" w:space="1" w:color="auto"/>
+        </w:pBdr>
+        <w:snapToGrid w:val="0"/>
+        <w:ind w:left="360"/>
+        <w:rPr>
+          <w:b/>
+          <w:bCs/>
+        </w:rPr>
+      </w:pPr>
+      <w:r>
+        <w:rPr>
+          <w:rFonts w:hint="eastAsia"/>
+          <w:b/>
+          <w:bCs/>
+        </w:rPr>
+        <w:t>ミニマップの座標計算を、拡大縮小ボタンを操作した後に自動で実行できるようにしてください。現状は拡大縮小ボタンで表示画面を調整したあとに、ミニマップ上をクリックしないと再計算されないため不便です。</w:t>
+      </w:r>
+    </w:p>
+    <w:p>
+      <w:pPr>
+        <w:pStyle w:val="a9"/>
+        <w:snapToGrid w:val="0"/>
+        <w:ind w:left="360"/>
+        <w:rPr>
+          <w:b/>
+          <w:bCs/>
+        </w:rPr>
+      </w:pPr>
+      <w:r>
+        <w:rPr>
+          <w:rFonts w:hint="eastAsia"/>
+          <w:b/>
+          <w:bCs/>
+        </w:rPr>
+        <w:t>ノードやエッジ/エッジラベル、サブグラフ（クラスター）をクリックしたときにも</w:t>
+      </w:r>
+      <w:r>
+        <w:rPr>
+          <w:rFonts w:hint="eastAsia"/>
+          <w:b/>
+          <w:bCs/>
+        </w:rPr>
+        <w:t>ミニマップの座標計算を</w:t>
+      </w:r>
+      <w:r>
+        <w:rPr>
+          <w:rFonts w:hint="eastAsia"/>
+          <w:b/>
+          <w:bCs/>
+        </w:rPr>
+        <w:t>するようにしてください。</w:t>
+      </w:r>
+    </w:p>
+    <w:p>
+      <w:pPr>
+        <w:pStyle w:val="a9"/>
+        <w:snapToGrid w:val="0"/>
+        <w:ind w:left="360"/>
+        <w:rPr>
+          <w:b/>
+          <w:bCs/>
+        </w:rPr>
+      </w:pPr>
+    </w:p>
+    <w:p>
+      <w:pPr>
+        <w:pStyle w:val="a9"/>
+        <w:snapToGrid w:val="0"/>
+        <w:ind w:left="360"/>
+        <w:rPr>
+          <w:b/>
+          <w:bCs/>
+        </w:rPr>
+      </w:pPr>
+    </w:p>
+    <w:p>
+      <w:pPr>
+        <w:pStyle w:val="a9"/>
+        <w:snapToGrid w:val="0"/>
+        <w:ind w:left="360"/>
+        <w:rPr>
+          <w:b/>
+          <w:bCs/>
+        </w:rPr>
+      </w:pPr>
+      <w:r>
+        <w:rPr>
+          <w:rFonts w:hint="eastAsia"/>
+          <w:b/>
+          <w:bCs/>
+        </w:rPr>
+        <w:t>――</w:t>
+      </w:r>
+    </w:p>
+    <w:p>
+      <w:pPr>
+        <w:pStyle w:val="a9"/>
+        <w:snapToGrid w:val="0"/>
+        <w:ind w:left="360"/>
+        <w:rPr>
+          <w:rFonts w:hint="eastAsia"/>
+          <w:b/>
+          <w:bCs/>
+        </w:rPr>
+      </w:pPr>
+      <w:r>
+        <w:rPr>
+          <w:rFonts w:hint="eastAsia"/>
+          <w:b/>
+          <w:bCs/>
+        </w:rPr>
+        <w:t>長時間の実装となりそうなので、あなた</w:t>
+      </w:r>
+      <w:proofErr w:type="spellStart"/>
+      <w:r>
+        <w:rPr>
+          <w:rFonts w:hint="eastAsia"/>
+          <w:b/>
+          <w:bCs/>
+        </w:rPr>
+        <w:t>ClaudeCode</w:t>
+      </w:r>
+      <w:proofErr w:type="spellEnd"/>
+      <w:r>
+        <w:rPr>
+          <w:rFonts w:hint="eastAsia"/>
+          <w:b/>
+          <w:bCs/>
+        </w:rPr>
+        <w:t>のセッション変更で本仕様方針文脈が失われないように&lt;</w:t>
+      </w:r>
+      <w:r>
+        <w:rPr>
+          <w:b/>
+          <w:bCs/>
+        </w:rPr>
+        <w:t>C:\dev\task-manager\docs</w:t>
+      </w:r>
+      <w:r>
+        <w:rPr>
+          <w:rFonts w:hint="eastAsia"/>
+          <w:b/>
+          <w:bCs/>
+        </w:rPr>
+        <w:t>&gt;へ適切なディレクトリ構成と効果的なシンボリックリンクを考慮した仕様書作成方針をまずは検討してください。</w:t>
+      </w:r>
+    </w:p>
+    <w:p>
+      <w:pPr>
+        <w:pStyle w:val="a9"/>
+        <w:pBdr>
+          <w:bottom w:val="single" w:sz="6" w:space="1" w:color="auto"/>
+        </w:pBdr>
+        <w:snapToGrid w:val="0"/>
+        <w:ind w:left="360"/>
+        <w:rPr>
+          <w:b/>
+          <w:bCs/>
+        </w:rPr>
+      </w:pPr>
+    </w:p>
+    <w:p>
+      <w:pPr>
+        <w:pStyle w:val="a9"/>
+        <w:snapToGrid w:val="0"/>
+        <w:ind w:left="360"/>
+        <w:rPr>
+          <w:b/>
+          <w:bCs/>
+        </w:rPr>
+      </w:pPr>
+      <w:r>
+        <w:rPr>
+          <w:rFonts w:hint="eastAsia"/>
+          <w:b/>
+          <w:bCs/>
+        </w:rPr>
+        <w:t>「</w:t>
+      </w:r>
+      <w:r>
+        <w:rPr>
+          <w:rFonts w:hint="eastAsia"/>
+          <w:b/>
+          <w:bCs/>
+        </w:rPr>
+        <w:t>ページを再読み込み（</w:t>
+      </w:r>
+      <w:r>
+        <w:rPr>
+          <w:b/>
+          <w:bCs/>
+        </w:rPr>
+        <w:t xml:space="preserve">Ctrl+F5）して、ノードのラベルを編集 → </w:t>
+      </w:r>
+      <w:r>
+        <w:rPr>
+          <w:rFonts w:ascii="Cambria Math" w:hAnsi="Cambria Math" w:cs="Cambria Math"/>
+          <w:b/>
+          <w:bCs/>
+        </w:rPr>
+        <w:t>↺</w:t>
+      </w:r>
+      <w:r>
+        <w:rPr>
+          <w:b/>
+          <w:bCs/>
+        </w:rPr>
+        <w:t>ボタンで元に戻ることを確認してください！</w:t>
+      </w:r>
+      <w:r>
+        <w:rPr>
+          <w:rFonts w:hint="eastAsia"/>
+          <w:b/>
+          <w:bCs/>
+        </w:rPr>
+        <w:t>」</w:t>
+      </w:r>
+      <w:r>
+        <w:rPr>
+          <w:rFonts w:hint="eastAsia"/>
+          <w:b/>
+          <w:bCs/>
+        </w:rPr>
+        <w:t>と先ほど言っていましたが「</w:t>
+      </w:r>
+      <w:r>
+        <w:rPr>
+          <w:rFonts w:ascii="Cambria Math" w:hAnsi="Cambria Math" w:cs="Cambria Math"/>
+          <w:b/>
+          <w:bCs/>
+        </w:rPr>
+        <w:t>↺</w:t>
+      </w:r>
+      <w:r>
+        <w:rPr>
+          <w:b/>
+          <w:bCs/>
+        </w:rPr>
+        <w:t>ボタン</w:t>
+      </w:r>
+      <w:r>
+        <w:rPr>
+          <w:rFonts w:hint="eastAsia"/>
+          <w:b/>
+          <w:bCs/>
+        </w:rPr>
+        <w:t>」がみあたりません。要素情報画面内のカスタムラベル見出し付近にあるべきではないですか？</w:t>
+      </w:r>
+    </w:p>
+    <w:p>
+      <w:pPr>
+        <w:pStyle w:val="a9"/>
+        <w:snapToGrid w:val="0"/>
+        <w:ind w:left="360"/>
+        <w:rPr>
+          <w:b/>
+          <w:bCs/>
+        </w:rPr>
+      </w:pPr>
+    </w:p>
+    <w:p>
+      <w:pPr>
+        <w:pStyle w:val="a9"/>
+        <w:pBdr>
+          <w:bottom w:val="single" w:sz="6" w:space="1" w:color="auto"/>
+        </w:pBdr>
+        <w:snapToGrid w:val="0"/>
+        <w:ind w:left="360"/>
+        <w:rPr>
+          <w:b/>
+          <w:bCs/>
+        </w:rPr>
+      </w:pPr>
+    </w:p>
+    <w:p>
+      <w:pPr>
+        <w:pStyle w:val="a9"/>
+        <w:snapToGrid w:val="0"/>
+        <w:ind w:left="360"/>
+        <w:rPr>
+          <w:b/>
+          <w:bCs/>
+        </w:rPr>
+      </w:pPr>
+      <w:hyperlink r:id="rId13" w:history="1">
+        <w:r>
+          <w:rPr>
+            <w:rStyle w:val="ae"/>
+            <w:b/>
+            <w:bCs/>
+          </w:rPr>
+          <w:t>file:///C:/dev/task-manager/docs/ui/flowchart-mockup-interactive.html</w:t>
+        </w:r>
+      </w:hyperlink>
+      <w:r>
+        <w:rPr>
+          <w:rFonts w:hint="eastAsia"/>
+          <w:b/>
+          <w:bCs/>
+        </w:rPr>
+        <w:t>の要素情報画面のヘッダー高さを「ミニマップ」画面と同様のミニマム</w:t>
+      </w:r>
+      <w:r>
+        <w:rPr>
+          <w:rFonts w:hint="eastAsia"/>
+          <w:b/>
+          <w:bCs/>
+        </w:rPr>
+        <w:t>サイズにしてください。</w:t>
+      </w:r>
+    </w:p>
+    <w:p>
+      <w:pPr>
+        <w:pStyle w:val="a9"/>
+        <w:snapToGrid w:val="0"/>
+        <w:ind w:left="360"/>
+        <w:rPr>
+          <w:b/>
+          <w:bCs/>
+        </w:rPr>
+      </w:pPr>
+    </w:p>
+    <w:p>
+      <w:pPr>
+        <w:pStyle w:val="a9"/>
+        <w:pBdr>
+          <w:bottom w:val="single" w:sz="6" w:space="1" w:color="auto"/>
+        </w:pBdr>
+        <w:snapToGrid w:val="0"/>
+        <w:ind w:left="360"/>
+        <w:rPr>
+          <w:b/>
+          <w:bCs/>
+        </w:rPr>
+      </w:pPr>
+    </w:p>
+    <w:p>
+      <w:pPr>
+        <w:pStyle w:val="a9"/>
+        <w:snapToGrid w:val="0"/>
+        <w:ind w:left="360"/>
+        <w:rPr>
+          <w:b/>
+          <w:bCs/>
+        </w:rPr>
+      </w:pPr>
+      <w:r>
+        <w:rPr>
+          <w:rFonts w:hint="eastAsia"/>
+          <w:b/>
+          <w:bCs/>
+        </w:rPr>
+        <w:t>ミニマップの最小表示が機能していません。要素情報画面は非表示ボタンとヘッダーにパネル非表示（と表示）ボタンがあるのにミニマップの非表示・表示ボタンがないのは不自然です。どのようなUI/UXが最適か提案してください。</w:t>
+      </w:r>
+    </w:p>
+    <w:p>
+      <w:pPr>
+        <w:pStyle w:val="a9"/>
+        <w:snapToGrid w:val="0"/>
+        <w:ind w:left="360"/>
+        <w:rPr>
+          <w:b/>
+          <w:bCs/>
+        </w:rPr>
+      </w:pPr>
+    </w:p>
+    <w:p>
+      <w:pPr>
+        <w:pStyle w:val="a9"/>
+        <w:snapToGrid w:val="0"/>
+        <w:ind w:left="360"/>
+        <w:rPr>
+          <w:b/>
+          <w:bCs/>
+        </w:rPr>
+      </w:pPr>
+    </w:p>
+    <w:p>
+      <w:pPr>
+        <w:pStyle w:val="a9"/>
+        <w:pBdr>
+          <w:bottom w:val="single" w:sz="6" w:space="1" w:color="auto"/>
+        </w:pBdr>
+        <w:snapToGrid w:val="0"/>
+        <w:ind w:left="360"/>
+        <w:rPr>
+          <w:b/>
+          <w:bCs/>
+        </w:rPr>
+      </w:pPr>
+    </w:p>
+    <w:p>
+      <w:pPr>
+        <w:pStyle w:val="a9"/>
+        <w:snapToGrid w:val="0"/>
+        <w:ind w:left="360"/>
+        <w:rPr>
+          <w:b/>
+          <w:bCs/>
+        </w:rPr>
+      </w:pPr>
+      <w:r>
+        <w:rPr>
+          <w:rFonts w:hint="eastAsia"/>
+          <w:b/>
+          <w:bCs/>
+        </w:rPr>
+        <w:t>ヘッダーの拡大・縮小・リセットボタンを</w:t>
+      </w:r>
+      <w:r>
+        <w:rPr>
+          <w:b/>
+          <w:bCs/>
+        </w:rPr>
+        <w:t>"C:\dev\task-manager\docs\ui\拡大・縮小・リセット機能向け SVGアイコンカタログ.html"</w:t>
+      </w:r>
+      <w:r>
+        <w:rPr>
+          <w:rFonts w:hint="eastAsia"/>
+          <w:b/>
+          <w:bCs/>
+        </w:rPr>
+        <w:t>のアイコン表示のみとしてください。テキスト表示は不要です。</w:t>
+      </w:r>
+    </w:p>
+    <w:p>
+      <w:pPr>
+        <w:pStyle w:val="a9"/>
+        <w:snapToGrid w:val="0"/>
+        <w:ind w:left="360"/>
+        <w:rPr>
+          <w:b/>
+          <w:bCs/>
+        </w:rPr>
+      </w:pPr>
+      <w:r>
+        <w:rPr>
+          <w:rFonts w:hint="eastAsia"/>
+          <w:b/>
+          <w:bCs/>
+        </w:rPr>
+        <w:t>また、ミニマップの下端にも上記と同様のアイコンボタンセットを配置してください。ミニマップは小さいためアイコンボタンセットも不自然にならない程度に小さくしてください。</w:t>
+      </w:r>
+    </w:p>
+    <w:p>
+      <w:pPr>
+        <w:pStyle w:val="a9"/>
+        <w:snapToGrid w:val="0"/>
+        <w:ind w:left="360"/>
+        <w:rPr>
+          <w:b/>
+          <w:bCs/>
+        </w:rPr>
+      </w:pPr>
+    </w:p>
+    <w:p>
+      <w:pPr>
+        <w:pStyle w:val="a9"/>
+        <w:pBdr>
+          <w:bottom w:val="single" w:sz="6" w:space="1" w:color="auto"/>
+        </w:pBdr>
+        <w:snapToGrid w:val="0"/>
+        <w:ind w:left="360"/>
+        <w:rPr>
+          <w:b/>
+          <w:bCs/>
+        </w:rPr>
+      </w:pPr>
+    </w:p>
+    <w:p>
+      <w:pPr>
+        <w:pStyle w:val="a9"/>
+        <w:snapToGrid w:val="0"/>
+        <w:ind w:left="360"/>
+        <w:rPr>
+          <w:b/>
+          <w:bCs/>
+        </w:rPr>
+      </w:pPr>
+      <w:r>
+        <w:rPr>
+          <w:rFonts w:hint="eastAsia"/>
+          <w:b/>
+          <w:bCs/>
+        </w:rPr>
+        <w:t>ミニマップのズームセットボタンが表示されていません</w:t>
+      </w:r>
+      <w:r>
+        <w:rPr>
+          <w:rFonts w:hint="eastAsia"/>
+          <w:b/>
+          <w:bCs/>
+        </w:rPr>
+        <w:t>。何度も言わせないでください</w:t>
+      </w:r>
+    </w:p>
+    <w:p>
+      <w:pPr>
+        <w:pStyle w:val="a9"/>
+        <w:pBdr>
+          <w:bottom w:val="single" w:sz="6" w:space="1" w:color="auto"/>
+        </w:pBdr>
+        <w:snapToGrid w:val="0"/>
+        <w:ind w:left="360"/>
+        <w:rPr>
+          <w:b/>
+          <w:bCs/>
+        </w:rPr>
+      </w:pPr>
+    </w:p>
+    <w:p>
+      <w:pPr>
+        <w:pStyle w:val="a9"/>
+        <w:snapToGrid w:val="0"/>
+        <w:ind w:left="360"/>
+        <w:rPr>
+          <w:b/>
+          <w:bCs/>
+        </w:rPr>
+      </w:pPr>
+      <w:r>
+        <w:rPr>
+          <w:rFonts w:hint="eastAsia"/>
+          <w:b/>
+          <w:bCs/>
+        </w:rPr>
+        <w:t>エッジ追加モードで十字カーソルにな</w:t>
+      </w:r>
+      <w:r>
+        <w:rPr>
+          <w:rFonts w:hint="eastAsia"/>
+          <w:b/>
+          <w:bCs/>
+        </w:rPr>
+        <w:t>りましたが線が引けません。もっと速度感を持って実装してください。牛歩のような開発速度です</w:t>
+      </w:r>
+    </w:p>
+    <w:p>
+      <w:pPr>
+        <w:pStyle w:val="a9"/>
+        <w:snapToGrid w:val="0"/>
+        <w:ind w:left="360"/>
+        <w:rPr>
+          <w:b/>
+          <w:bCs/>
+        </w:rPr>
+      </w:pPr>
+    </w:p>
+    <w:p>
+      <w:pPr>
+        <w:pStyle w:val="a9"/>
+        <w:snapToGrid w:val="0"/>
+        <w:ind w:left="360"/>
+        <w:rPr>
+          <w:b/>
+          <w:bCs/>
+        </w:rPr>
+      </w:pPr>
+      <w:r>
+        <w:rPr>
+          <w:rFonts w:hint="eastAsia"/>
+          <w:b/>
+          <w:bCs/>
+        </w:rPr>
+        <w:t>ミニマップのズームセットが表示されましたが流石に小さすぎます。視認性を高めてください。例えば、SVGは維持しながらも拡大縮小は－＋の表示とすることで虫眼鏡よりも視認性が高まりますよね？リセットボタンは現状維持でよいです。パーセント表示の数字ももう少し大きく表示できるはずです</w:t>
+      </w:r>
+    </w:p>
+    <w:p>
+      <w:pPr>
+        <w:pStyle w:val="a9"/>
+        <w:snapToGrid w:val="0"/>
+        <w:ind w:left="360"/>
+        <w:rPr>
+          <w:b/>
+          <w:bCs/>
+        </w:rPr>
+      </w:pPr>
+    </w:p>
+    <w:p>
+      <w:pPr>
+        <w:pStyle w:val="a9"/>
+        <w:pBdr>
+          <w:bottom w:val="single" w:sz="6" w:space="1" w:color="auto"/>
+        </w:pBdr>
+        <w:snapToGrid w:val="0"/>
+        <w:ind w:left="360"/>
+        <w:rPr>
+          <w:b/>
+          <w:bCs/>
+        </w:rPr>
+      </w:pPr>
+    </w:p>
+    <w:p>
+      <w:pPr>
+        <w:pStyle w:val="a9"/>
+        <w:snapToGrid w:val="0"/>
+        <w:ind w:left="360"/>
+        <w:rPr>
+          <w:b/>
+          <w:bCs/>
+        </w:rPr>
+      </w:pPr>
+      <w:r>
+        <w:rPr>
+          <w:rFonts w:hint="eastAsia"/>
+          <w:b/>
+          <w:bCs/>
+        </w:rPr>
+        <w:t>メモエッジが引けましたが、選択時の捕捉感度が低すぎて不便です。これはメモエッジだけではなくメインエッジでも同様であるため、さらに選択しやすく感度範囲を広げてください。</w:t>
+      </w:r>
+    </w:p>
+    <w:p>
+      <w:pPr>
+        <w:pStyle w:val="a9"/>
+        <w:snapToGrid w:val="0"/>
+        <w:ind w:left="360"/>
+        <w:rPr>
+          <w:b/>
+          <w:bCs/>
+        </w:rPr>
+      </w:pPr>
+    </w:p>
+    <w:p>
+      <w:pPr>
+        <w:pStyle w:val="a9"/>
+        <w:pBdr>
+          <w:bottom w:val="single" w:sz="6" w:space="1" w:color="auto"/>
+        </w:pBdr>
+        <w:snapToGrid w:val="0"/>
+        <w:ind w:left="360"/>
+        <w:rPr>
+          <w:b/>
+          <w:bCs/>
+        </w:rPr>
+      </w:pPr>
+    </w:p>
+    <w:p>
+      <w:pPr>
+        <w:pStyle w:val="a9"/>
+        <w:snapToGrid w:val="0"/>
+        <w:ind w:left="360"/>
+        <w:rPr>
+          <w:b/>
+          <w:bCs/>
+        </w:rPr>
+      </w:pPr>
+      <w:r>
+        <w:rPr>
+          <w:rFonts w:hint="eastAsia"/>
+          <w:b/>
+          <w:bCs/>
+        </w:rPr>
+        <w:t>保存、インポート、エクスポート関係ボタンが乱立していて最悪なUIになっています。</w:t>
+      </w:r>
+      <w:hyperlink r:id="rId14" w:history="1">
+        <w:r>
+          <w:rPr>
+            <w:rStyle w:val="ae"/>
+            <w:b/>
+            <w:bCs/>
+          </w:rPr>
+          <w:t>file:///C:/dev/task-manager/task-manager.html</w:t>
+        </w:r>
+        <w:r>
+          <w:rPr>
+            <w:rStyle w:val="ae"/>
+            <w:rFonts w:hint="eastAsia"/>
+            <w:b/>
+            <w:bCs/>
+          </w:rPr>
+          <w:t>と同じ路線でSVGアイコンを利用してUI</w:t>
+        </w:r>
+      </w:hyperlink>
+      <w:r>
+        <w:rPr>
+          <w:rFonts w:hint="eastAsia"/>
+          <w:b/>
+          <w:bCs/>
+        </w:rPr>
+        <w:t>を整理してください。</w:t>
+      </w:r>
+    </w:p>
+    <w:p>
+      <w:pPr>
+        <w:pStyle w:val="a9"/>
+        <w:snapToGrid w:val="0"/>
+        <w:ind w:left="360"/>
+        <w:rPr>
+          <w:b/>
+          <w:bCs/>
+        </w:rPr>
+      </w:pPr>
+      <w:r>
+        <w:rPr>
+          <w:rFonts w:hint="eastAsia"/>
+          <w:b/>
+          <w:bCs/>
+        </w:rPr>
+        <w:t>簡易的なアスキーアートで実装イメージを教えてください。</w:t>
+      </w:r>
+    </w:p>
+    <w:p>
+      <w:pPr>
+        <w:pStyle w:val="a9"/>
+        <w:snapToGrid w:val="0"/>
+        <w:ind w:left="360"/>
+        <w:rPr>
+          <w:b/>
+          <w:bCs/>
+        </w:rPr>
+      </w:pPr>
+      <w:r>
+        <w:rPr>
+          <w:b/>
+          <w:bCs/>
+        </w:rPr>
+        <w:t>**まだ実装はせず見解のみを教えて下さい**</w:t>
+      </w:r>
+    </w:p>
+    <w:p>
+      <w:pPr>
+        <w:pStyle w:val="a9"/>
+        <w:snapToGrid w:val="0"/>
+        <w:ind w:left="360"/>
+        <w:rPr>
+          <w:b/>
+          <w:bCs/>
+        </w:rPr>
+      </w:pPr>
+    </w:p>
+    <w:p>
+      <w:pPr>
+        <w:pStyle w:val="a9"/>
+        <w:pBdr>
+          <w:bottom w:val="single" w:sz="6" w:space="1" w:color="auto"/>
+        </w:pBdr>
+        <w:snapToGrid w:val="0"/>
+        <w:ind w:left="360"/>
+        <w:rPr>
+          <w:b/>
+          <w:bCs/>
+        </w:rPr>
+      </w:pPr>
+    </w:p>
+    <w:p>
+      <w:pPr>
+        <w:pStyle w:val="a9"/>
+        <w:snapToGrid w:val="0"/>
+        <w:ind w:left="360"/>
+        <w:rPr>
+          <w:rFonts w:hint="eastAsia"/>
+          <w:b/>
+          <w:bCs/>
+        </w:rPr>
+      </w:pPr>
+      <w:r>
+        <w:rPr>
+          <w:rFonts w:hint="eastAsia"/>
+          <w:b/>
+          <w:bCs/>
+        </w:rPr>
+        <w:t>上記のエッジクリック感度向上仕様は毎回SVGを読み込み時にエッジへ適用されるルールベースの仕様でよいですか？毎回特別な仕様を実装しないと感度が上がらないようでは困りますので聞きました。</w:t>
+      </w:r>
     </w:p>
     <w:sectPr>
       <w:pgSz w:w="11906" w:h="16838"/>

</xml_diff>